<commit_message>
female_dm, figures and tables
Introduced and harmonized the 'female_dm' variable indicating who decided on crop income for Malawi, using new code for extracting and processing decision-maker information. Updated figures.R to include new tables and visualizations for survey timing, legume intensification, and cropping practices, and improved Ethiopia and Tanzania scripts for consistency in variable naming and analysis. Minor code cleanups and label updates across scripts.
</commit_message>
<xml_diff>
--- a/Manuscript.docx
+++ b/Manuscript.docx
@@ -7,7 +7,13 @@
         <w:pStyle w:val="Title"/>
       </w:pPr>
       <w:r>
-        <w:t>Legume-based intensification in East and Southern Africa: food security impacts and the role of gender</w:t>
+        <w:t xml:space="preserve">Legume-based intensification </w:t>
+      </w:r>
+      <w:r>
+        <w:t xml:space="preserve">of maize production </w:t>
+      </w:r>
+      <w:r>
+        <w:t>in East and Southern Africa: food security impacts and the role of gender</w:t>
       </w:r>
     </w:p>
     <w:p>
@@ -157,13 +163,7 @@
         <w:t>.</w:t>
       </w:r>
       <w:r>
-        <w:t xml:space="preserve"> The demand must be met on ecological and environmental gr</w:t>
-      </w:r>
-      <w:r>
-        <w:t>ounds without further expansion of agricultural land at the expense of biodiversity loss and associated greenhouse gas emissions. Fortunately, evidence shows that there is sufficient yield potential in the region's main crops to increase production on existing cr</w:t>
-      </w:r>
-      <w:r>
-        <w:t xml:space="preserve">opland </w:t>
+        <w:t xml:space="preserve"> The demand must be met on ecological and environmental grounds without further expansion of agricultural land at the expense of biodiversity loss and associated greenhouse gas emissions. Fortunately, evidence shows that there is sufficient yield potential in the region's main crops to increase production on existing cropland </w:t>
       </w:r>
       <w:r>
         <w:fldChar w:fldCharType="begin"/>
@@ -201,36 +201,33 @@
         <w:t>s are</w:t>
       </w:r>
       <w:r>
-        <w:t xml:space="preserve"> not accelerated</w:t>
+        <w:t xml:space="preserve"> not accelerated </w:t>
+      </w:r>
+      <w:r>
+        <w:fldChar w:fldCharType="begin"/>
+      </w:r>
+      <w:r>
+        <w:instrText xml:space="preserve"> ADDIN ZOTERO_ITEM CSL_CITATION {"citationID":"pwDgVaci","properties":{"formattedCitation":"(Aramburu-Merlos et al., 2024)","plainCitation":"(Aramburu-Merlos et al., 2024)","noteIndex":0},"citationItems":[{"id":1795,"uris":["http://zotero.org/groups/5881550/items/WD3G4S3B"],"itemData":{"id":1795,"type":"article-journal","abstract":"Maize demand in Sub-Saharan Africa is expected to increase 2.3 times during the next 30 years driven by demographic and dietary changes. Over the past two decades, the area cropped with maize has expanded by 17 million hectares in the region, with limited yield increase. Following this trend could potentially result in further maize cropland expansion and the need for imports to satisfy domestic demand. Here, we use data collected from 14,773 smallholder fields in the region to identify agronomic practices that can improve farm yield gains. We find that agronomic practices related to cultivar selection, and nutrient, pest, and crop management can double on-farm yields and provide an additional 82 million tons of maize within current cropped area. Research and development investments should be oriented towards agricultural practices with proven capacity to raise maize yields in the region.","container-title":"Nature Communications","DOI":"10.1038/s41467-024-48859-0","ISSN":"2041-1723","issue":"1","journalAbbreviation":"Nat Commun","language":"en","license":"2024 The Author(s)","note":"publisher: Nature Publishing Group","page":"4492","source":"www.nature.com","title":"Adopting yield-improving practices to meet maize demand in Sub-Saharan Africa without cropland expansion","volume":"15","author":[{"family":"Aramburu-Merlos","given":"Fernando"},{"family":"Tenorio","given":"Fatima A. M."},{"family":"Mashingaidze","given":"Nester"},{"family":"Sananka","given":"Alex"},{"family":"Aston","given":"Stephen"},{"family":"Ojeda","given":"Jonathan J."},{"family":"Grassini","given":"Patricio"}],"issued":{"date-parts":[["2024",5,27]]},"citation-key":"aramburu-merlosAdoptingYieldimprovingPractices2024"}}],"schema":"https://github.com/citation-style-language/schema/raw/master/csl-citation.json"} </w:instrText>
+      </w:r>
+      <w:r>
+        <w:fldChar w:fldCharType="separate"/>
+      </w:r>
+      <w:r>
+        <w:rPr>
+          <w:rFonts w:cs="Calibri"/>
+        </w:rPr>
+        <w:t>(Aramburu-Merlos et al., 2024)</w:t>
+      </w:r>
+      <w:r>
+        <w:fldChar w:fldCharType="end"/>
+      </w:r>
+      <w:r>
+        <w:t>.</w:t>
       </w:r>
       <w:r>
         <w:t xml:space="preserve"> </w:t>
       </w:r>
       <w:r>
-        <w:fldChar w:fldCharType="begin"/>
-      </w:r>
-      <w:r>
-        <w:instrText xml:space="preserve"> ADDIN ZOTERO_ITEM CSL_CITATION {"citationID":"pwDgVaci","properties":{"formattedCitation":"(Aramburu-Merlos et al., 2024)","plainCitation":"(Aramburu-Merlos et al., 2024)","noteIndex":0},"citationItems":[{"id":1795,"uris":["http://zotero.org/groups/5881550/items/WD3G4S3B"],"itemData":{"id":1795,"type":"article-journal","abstract":"Maize demand in Sub-Saharan Africa is expected to increase 2.3 times during the next 30 years driven by demographic and dietary changes. Over the past two decades, the area cropped with maize has expanded by 17 million hectares in the region, with limited yield increase. Following this trend could potentially result in further maize cropland expansion and the need for imports to satisfy domestic demand. Here, we use data collected from 14,773 smallholder fields in the region to identify agronomic practices that can improve farm yield gains. We find that agronomic practices related to cultivar selection, and nutrient, pest, and crop management can double on-farm yields and provide an additional 82 million tons of maize within current cropped area. Research and development investments should be oriented towards agricultural practices with proven capacity to raise maize yields in the region.","container-title":"Nature Communications","DOI":"10.1038/s41467-024-48859-0","ISSN":"2041-1723","issue":"1","journalAbbreviation":"Nat Commun","language":"en","license":"2024 The Author(s)","note":"publisher: Nature Publishing Group","page":"4492","source":"www.nature.com","title":"Adopting yield-improving practices to meet maize demand in Sub-Saharan Africa without cropland expansion","volume":"15","author":[{"family":"Aramburu-Merlos","given":"Fernando"},{"family":"Tenorio","given":"Fatima A. M."},{"family":"Mashingaidze","given":"Nester"},{"family":"Sananka","given":"Alex"},{"family":"Aston","given":"Stephen"},{"family":"Ojeda","given":"Jonathan J."},{"family":"Grassini","given":"Patricio"}],"issued":{"date-parts":[["2024",5,27]]},"citation-key":"aramburu-merlosAdoptingYieldimprovingPractices2024"}}],"schema":"https://github.com/citation-style-language/schema/raw/master/csl-citation.json"} </w:instrText>
-      </w:r>
-      <w:r>
-        <w:fldChar w:fldCharType="separate"/>
-      </w:r>
-      <w:r>
-        <w:rPr>
-          <w:rFonts w:cs="Calibri"/>
-        </w:rPr>
-        <w:t>(Aramburu-Merlos et al., 2024)</w:t>
-      </w:r>
-      <w:r>
-        <w:fldChar w:fldCharType="end"/>
-      </w:r>
-      <w:r>
-        <w:t>.</w:t>
-      </w:r>
-      <w:r>
-        <w:t xml:space="preserve"> </w:t>
-      </w:r>
-      <w:r>
         <w:t>One promising approach to achieve this intensification is the diversification of maize production systems through legume rotations or intercrops—a</w:t>
       </w:r>
       <w:r>
@@ -243,10 +240,7 @@
         <w:t xml:space="preserve"> for resource-poor smallholders</w:t>
       </w:r>
       <w:r>
-        <w:t xml:space="preserve"> that has received considerable attention from national governments, development organizations, and foundations.</w:t>
-      </w:r>
-      <w:r>
-        <w:t xml:space="preserve"> </w:t>
+        <w:t xml:space="preserve"> that has received considerable attention from national governments, development organizations, and foundations. </w:t>
       </w:r>
       <w:r>
         <w:t xml:space="preserve">Integration of legumes into maize production systems has been shown to significantly increase yields </w:t>
@@ -437,13 +431,7 @@
         <w:fldChar w:fldCharType="end"/>
       </w:r>
       <w:r>
-        <w:t xml:space="preserve">, </w:t>
-      </w:r>
-      <w:r>
-        <w:t>creating particular disadvantages for female farm managers</w:t>
-      </w:r>
-      <w:r>
-        <w:t xml:space="preserve"> who are often </w:t>
+        <w:t xml:space="preserve">, creating particular disadvantages for female farm managers who are often </w:t>
       </w:r>
       <w:r>
         <w:t>labor</w:t>
@@ -470,13 +458,7 @@
         <w:fldChar w:fldCharType="end"/>
       </w:r>
       <w:r>
-        <w:t xml:space="preserve">. </w:t>
-      </w:r>
-      <w:r>
-        <w:t xml:space="preserve">Moreover, </w:t>
-      </w:r>
-      <w:r>
-        <w:t>women often prioritize immediate food security over long-term soil fertility improvements</w:t>
+        <w:t>. Moreover, women often prioritize immediate food security over long-term soil fertility improvements</w:t>
       </w:r>
       <w:r>
         <w:t xml:space="preserve"> </w:t>
@@ -530,16 +512,7 @@
         <w:t>.</w:t>
       </w:r>
       <w:r>
-        <w:t xml:space="preserve"> </w:t>
-      </w:r>
-      <w:r>
-        <w:t xml:space="preserve">Conversely, women's reproductive roles may </w:t>
-      </w:r>
-      <w:r>
-        <w:t>also</w:t>
-      </w:r>
-      <w:r>
-        <w:t xml:space="preserve"> facilitate legume-based intensification. The integration of legumes into maize production systems enhances crop diversity</w:t>
+        <w:t xml:space="preserve"> Conversely, women's reproductive roles may also facilitate legume-based intensification. The integration of legumes into maize production systems enhances crop diversity</w:t>
       </w:r>
       <w:r>
         <w:t xml:space="preserve"> and protein supply</w:t>
@@ -598,228 +571,197 @@
         <w:footnoteReference w:id="1"/>
       </w:r>
       <w:r>
-        <w:t>.</w:t>
+        <w:t xml:space="preserve">. </w:t>
+      </w:r>
+      <w:r>
+        <w:fldChar w:fldCharType="begin"/>
+      </w:r>
+      <w:r>
+        <w:instrText xml:space="preserve"> ADDIN ZOTERO_ITEM CSL_CITATION {"citationID":"KeKcQ7A6","properties":{"custom":"Osewe et al. (2023)","formattedCitation":"Osewe et al. (2023)","plainCitation":"Osewe et al. (2023)","noteIndex":0},"citationItems":[{"id":1908,"uris":["http://zotero.org/groups/5881550/items/RJE3N9JC"],"itemData":{"id":1908,"type":"article-journal","container-title":"Global Food Security","DOI":"10.1016/j.gfs.2023.100724","ISSN":"22119124","journalAbbreviation":"Global Food Security","language":"en","page":"100724","source":"DOI.org (Crossref)","title":"Sustainable intensification and food security: A panel data assessment of the smallholder maize farmers in Uganda","title-short":"Sustainable intensification and food security","volume":"39","author":[{"family":"Osewe","given":"Maurice"},{"family":"Aijun","given":"Liu"},{"family":"Jiqin","given":"Han"}],"issued":{"date-parts":[["2023",12]]},"citation-key":"oseweSustainableIntensificationFood2023a"}}],"schema":"https://github.com/citation-style-language/schema/raw/master/csl-citation.json"} </w:instrText>
+      </w:r>
+      <w:r>
+        <w:fldChar w:fldCharType="separate"/>
+      </w:r>
+      <w:r>
+        <w:t>Osewe et al. (2023)</w:t>
+      </w:r>
+      <w:r>
+        <w:fldChar w:fldCharType="end"/>
+      </w:r>
+      <w:r>
+        <w:t xml:space="preserve">, using Uganda National Panel Survey data, demonstrated that the joint use of inorganic fertilizer and maize-legume intercropping significantly improves household food security, while maize-legume intercropping alone had negative effects on food security, underscoring the necessity of complementing intercropping with inorganic inputs. Similarly, </w:t>
+      </w:r>
+      <w:r>
+        <w:fldChar w:fldCharType="begin"/>
+      </w:r>
+      <w:r>
+        <w:instrText xml:space="preserve"> ADDIN ZOTERO_ITEM CSL_CITATION {"citationID":"cEoSK0l6","properties":{"custom":"Kim et al. (2019)","formattedCitation":"Kim et al. (2019)","plainCitation":"Kim et al. (2019)","noteIndex":0},"citationItems":[{"id":1926,"uris":["http://zotero.org/groups/5881550/items/KRVC27ZT"],"itemData":{"id":1926,"type":"article-journal","abstract":"Abstract\n            Food insecurity, child malnutrition, and land degradation remain persistent problems in sub</w:instrText>
+      </w:r>
+      <w:r>
+        <w:rPr>
+          <w:rFonts w:ascii="Cambria Math" w:hAnsi="Cambria Math" w:cs="Cambria Math"/>
+        </w:rPr>
+        <w:instrText>‐</w:instrText>
+      </w:r>
+      <w:r>
+        <w:instrText>Saharan Africa. Agricultural sustainable intensification (SI) has been proposed as a possible solution to simultaneously address these challenges. Yet there is little empirical evidence on if agricultural management practices and inputs that contribute to SI from an environmental standpoint do indeed improve food security or child nutrition. We use three waves of data from the nationally</w:instrText>
+      </w:r>
+      <w:r>
+        <w:rPr>
+          <w:rFonts w:ascii="Cambria Math" w:hAnsi="Cambria Math" w:cs="Cambria Math"/>
+        </w:rPr>
+        <w:instrText>‐</w:instrText>
+      </w:r>
+      <w:r>
+        <w:instrText>representative Tanzania National Panel Survey to analyze the child nutrition effects of rural households</w:instrText>
+      </w:r>
+      <w:r>
+        <w:rPr>
+          <w:rFonts w:cs="Georgia"/>
+        </w:rPr>
+        <w:instrText>’</w:instrText>
+      </w:r>
+      <w:r>
+        <w:instrText xml:space="preserve"> adoption of farming practices that can contribute to the SI of maize production. We group households into four categories based on their use of three soil fertility management practices on their maize plots: “Nonadoption”; “Intensification” (use of inorganic fertilizer only); “Sustainable” (use of organic fertilizer, maize–legume intercropping, or both); and “SI” (joint use of inorganic fertilizer with organic fertilizer and/or maize–legume intercropping). The results from multinomial endogenous treatment effects models with the Mundlak–Chamberlain device suggest that use of practices in the “SI” category is associated with improvements in children's height</w:instrText>
+      </w:r>
+      <w:r>
+        <w:rPr>
+          <w:rFonts w:ascii="Cambria Math" w:hAnsi="Cambria Math" w:cs="Cambria Math"/>
+        </w:rPr>
+        <w:instrText>‐</w:instrText>
+      </w:r>
+      <w:r>
+        <w:instrText>for</w:instrText>
+      </w:r>
+      <w:r>
+        <w:rPr>
+          <w:rFonts w:ascii="Cambria Math" w:hAnsi="Cambria Math" w:cs="Cambria Math"/>
+        </w:rPr>
+        <w:instrText>‐</w:instrText>
+      </w:r>
+      <w:r>
+        <w:instrText>age and weight</w:instrText>
+      </w:r>
+      <w:r>
+        <w:rPr>
+          <w:rFonts w:ascii="Cambria Math" w:hAnsi="Cambria Math" w:cs="Cambria Math"/>
+        </w:rPr>
+        <w:instrText>‐</w:instrText>
+      </w:r>
+      <w:r>
+        <w:instrText>for</w:instrText>
+      </w:r>
+      <w:r>
+        <w:rPr>
+          <w:rFonts w:ascii="Cambria Math" w:hAnsi="Cambria Math" w:cs="Cambria Math"/>
+        </w:rPr>
+        <w:instrText>‐</w:instrText>
+      </w:r>
+      <w:r>
+        <w:instrText>age z</w:instrText>
+      </w:r>
+      <w:r>
+        <w:rPr>
+          <w:rFonts w:ascii="Cambria Math" w:hAnsi="Cambria Math" w:cs="Cambria Math"/>
+        </w:rPr>
+        <w:instrText>‐</w:instrText>
+      </w:r>
+      <w:r>
+        <w:instrText xml:space="preserve">scores relative to </w:instrText>
+      </w:r>
+      <w:r>
+        <w:rPr>
+          <w:rFonts w:cs="Georgia"/>
+        </w:rPr>
+        <w:instrText>“</w:instrText>
+      </w:r>
+      <w:r>
+        <w:instrText>Nonadoption,</w:instrText>
+      </w:r>
+      <w:r>
+        <w:rPr>
+          <w:rFonts w:cs="Georgia"/>
+        </w:rPr>
+        <w:instrText>”</w:instrText>
+      </w:r>
+      <w:r>
+        <w:instrText xml:space="preserve"> particularly for children aged 25</w:instrText>
+      </w:r>
+      <w:r>
+        <w:rPr>
+          <w:rFonts w:cs="Georgia"/>
+        </w:rPr>
+        <w:instrText>–</w:instrText>
+      </w:r>
+      <w:r>
+        <w:instrText xml:space="preserve">59 months. These effects appear to come through improvements in both crop income and productivity.","container-title":"Agricultural Economics","DOI":"10.1111/agec.12520","ISSN":"0169-5150, 1574-0862","issue":"6","journalAbbreviation":"Agricultural Economics","language":"en","page":"723-734","source":"DOI.org (Crossref)","title":"Does sustainable intensification of maize production enhance child nutrition? Evidence from rural Tanzania","title-short":"Does sustainable intensification of maize production enhance child nutrition?","volume":"50","author":[{"family":"Kim","given":"Jongwoo"},{"family":"Mason","given":"Nicole M."},{"family":"Snapp","given":"Sieglinde"},{"family":"Wu","given":"Felicia"}],"issued":{"date-parts":[["2019",11]]},"citation-key":"kimDoesSustainableIntensification2019"}}],"schema":"https://github.com/citation-style-language/schema/raw/master/csl-citation.json"} </w:instrText>
+      </w:r>
+      <w:r>
+        <w:fldChar w:fldCharType="separate"/>
+      </w:r>
+      <w:r>
+        <w:t>Kim et al. (2019)</w:t>
+      </w:r>
+      <w:r>
+        <w:fldChar w:fldCharType="end"/>
+      </w:r>
+      <w:r>
+        <w:t xml:space="preserve"> found that the combined use of inorganic fertilizer with maize-legume intercropping was associated with improved child nutrition in Tanzania, reinforcing the importance of integrating inorganic fertilizer into intercropping systems. </w:t>
+      </w:r>
+      <w:r>
+        <w:fldChar w:fldCharType="begin"/>
+      </w:r>
+      <w:r>
+        <w:instrText xml:space="preserve"> ADDIN ZOTERO_ITEM CSL_CITATION {"citationID":"z6iG1fue","properties":{"custom":"Azzarri et al. (2022)","formattedCitation":"Azzarri et al. (2022)","plainCitation":"Azzarri et al. (2022)","noteIndex":0},"citationItems":[{"id":1924,"uris":["http://zotero.org/groups/5881550/items/DE5ZKIHK"],"itemData":{"id":1924,"type":"article-journal","abstract":"We examine the association between on-farm production diversity on household dietary diversity in Malawi using microdata collected as part of an environmentally sustainable agricultural intensification program. The program primarily focuses on the integration of legumes into the cropping system through maize-legume intercropping and legume-legume intercropping. Relative to staple cereals such as maize, legumes are rich in micronutrients, contain better-quality protein, and lead to nitrogen fixation. Given the systematic difference we document between program beneficiaries and randomly sampled non-beneficiary (control) households, we employ causal instrumental variables mediation analysis to account for non-random selection and possible simultaneity between production and consumption decisions. We find a significant positive treatment effect on dietary diversity, led by an increase in production diversity. Analysis of potential pathways show that effects on dietary diversity stem mostly from consumption of diverse food items purchased from the market made possible through higher agricultural income. These findings highlight that, while increasing production for markets can enhance dietary diversity through higher income that would make affordable an expanded set of food items, the production of more nutritious crops such as pulses may not necessarily translate into greater own consumption. This may be due to the persistence of dietary habits, tastes, or other local factors that favor consumption of staples such as maize and encourage sales of more profitable and nutritious food items such as pulses. Pulses are a more affordable and environmentally sustainable source of protein than animal source food, and efforts should be made to enhance their nutritional awareness and contribution to sustainable food systems and healthier diets.","container-title":"PLOS ONE","DOI":"10.1371/journal.pone.0265947","ISSN":"1932-6203","issue":"3","journalAbbreviation":"PLoS ONE","language":"en","page":"e0265947","source":"DOI.org (Crossref)","title":"Plant different, eat different? Insights from participatory agricultural research","title-short":"Plant different, eat different?","volume":"17","author":[{"family":"Azzarri","given":"Carlo"},{"family":"Haile","given":"Beliyou"},{"family":"Letta","given":"Marco"}],"editor":[{"family":"Kruseman","given":"Gideon"}],"issued":{"date-parts":[["2022",3,25]]},"citation-key":"azzarriPlantDifferentEat2022"}}],"schema":"https://github.com/citation-style-language/schema/raw/master/csl-citation.json"} </w:instrText>
+      </w:r>
+      <w:r>
+        <w:fldChar w:fldCharType="separate"/>
+      </w:r>
+      <w:r>
+        <w:t>Azzarri et al. (2022)</w:t>
+      </w:r>
+      <w:r>
+        <w:fldChar w:fldCharType="end"/>
+      </w:r>
+      <w:r>
+        <w:t xml:space="preserve"> evaluated an agricultural intensification program integrating pulses into maize production systems in Malawi and found positive impacts on dietary diversity, primarily driven by increased income from maize production. However, in another study from Tanzania, </w:t>
+      </w:r>
+      <w:r>
+        <w:fldChar w:fldCharType="begin"/>
+      </w:r>
+      <w:r>
+        <w:instrText xml:space="preserve"> ADDIN ZOTERO_ITEM CSL_CITATION {"citationID":"qQZTcV69","properties":{"custom":"Santalucia and Sibhatu (2024)","formattedCitation":"Santalucia and Sibhatu (2024)","plainCitation":"Santalucia and Sibhatu (2024)","noteIndex":0},"citationItems":[{"id":1903,"uris":["http://zotero.org/groups/5881550/items/5XXZIV5X"],"itemData":{"id":1903,"type":"article-journal","abstract":"Climate-smart agricultural (CSA) practices are increasingly being promoted as nature-based solutions to improve the livelihoods of smallholder farm households amid a sharp increase in climate-change anomalies. However, the extent to which CSA practices contribute to smallholder food security and dietary diversity remains unclear. In this study, we use panel and nationally representative data from Tanzania to examine the association between two climate-smart agricultural practices, namely, improved maize varieties and maize-legume intercropping, and food security in smallholder farm households. We use maize yield per acre, adult-equivalent food expenditure, and household dietary diversity scores to measure household food security, representing three of the four food security pillars: availability, access, and utilization. We also examine the complementarity and potential advantages of combining improved maize seeds with fertilizers. Using standard panel data estimation approaches, we find a positive association between the adoption of improved maize varieties and maize-legume intercropping and an increase in food production measured through higher crop productivity. However, we do not find a corresponding improvement in household dietary diversity or increased food expenditure, despite the higher crop production. Several factors might explain this outcome, including the challenges faced by farmers in accessing markets to sell surplus produce, the influence of established dietary habits, gender issues, and other local factors that promote the consumption of cereal-based foods such as maize. Our findings suggest that CSA practices may help improve food production and availability, but more effort is needed to translate increased food production into improved dietary diversity and better food security among smallholder farmers in sub-Saharan Africa. [EconLit Citations: C23, D12, D13, D24, Q12, Q16, Q18, Q54]. © 2023 The Authors. Agribusiness published by Wiley Periodicals LLC.","container-title":"Agribusiness","DOI":"10.1002/agr.21892","ISSN":"0742-4477","issue":"2","journalAbbreviation":"Agribusiness","language":"English","note":"publisher: John Wiley and Sons Inc","page":"513-533","source":"Scopus","title":"Nourishing the farms, nourishing the plates: Association of climate-smart agricultural practices with household dietary diversity and food security in smallholders","title-short":"Nourishing the farms, nourishing the plates","volume":"40","author":[{"family":"Santalucia","given":"Simone"},{"family":"Sibhatu","given":"Kibrom T."}],"issued":{"date-parts":[["2024"]]},"citation-key":"santaluciaNourishingFarmsNourishing2024"}}],"schema":"https://github.com/citation-style-language/schema/raw/master/csl-citation.json"} </w:instrText>
+      </w:r>
+      <w:r>
+        <w:fldChar w:fldCharType="separate"/>
+      </w:r>
+      <w:r>
+        <w:t>Santalucia and Sibhatu (2024)</w:t>
+      </w:r>
+      <w:r>
+        <w:fldChar w:fldCharType="end"/>
+      </w:r>
+      <w:r>
+        <w:t xml:space="preserve"> found that despite improvements in maize yields, there was no evidence of impact on dietary diversity or food expenditure, highlighting the complexity of translating agricultural productivity gains into nutrition outcomes.</w:t>
+      </w:r>
+    </w:p>
+    <w:p>
+      <w:r>
+        <w:t>This paper contributes to the literature by examining how gender dynamics influence the adoption and effectiveness of legume-based agroecological intensification practices for food security outcomes among maize-producing smallholder farmers.</w:t>
+      </w:r>
+      <w:r>
+        <w:t xml:space="preserve"> Furthermore, we analyze the heterogeneous effects of maize-legume diversification on food security across varying household contexts, specifically examining differences by off-farm income, household wealth, production diversity, and inorganic fertilizer application.</w:t>
       </w:r>
       <w:r>
         <w:t xml:space="preserve"> </w:t>
       </w:r>
-      <w:r>
-        <w:fldChar w:fldCharType="begin"/>
-      </w:r>
-      <w:r>
-        <w:instrText xml:space="preserve"> ADDIN ZOTERO_ITEM CSL_CITATION {"citationID":"KeKcQ7A6","properties":{"custom":"Osewe et al. (2023)","formattedCitation":"Osewe et al. (2023)","plainCitation":"Osewe et al. (2023)","noteIndex":0},"citationItems":[{"id":1908,"uris":["http://zotero.org/groups/5881550/items/RJE3N9JC"],"itemData":{"id":1908,"type":"article-journal","container-title":"Global Food Security","DOI":"10.1016/j.gfs.2023.100724","ISSN":"22119124","journalAbbreviation":"Global Food Security","language":"en","page":"100724","source":"DOI.org (Crossref)","title":"Sustainable intensification and food security: A panel data assessment of the smallholder maize farmers in Uganda","title-short":"Sustainable intensification and food security","volume":"39","author":[{"family":"Osewe","given":"Maurice"},{"family":"Aijun","given":"Liu"},{"family":"Jiqin","given":"Han"}],"issued":{"date-parts":[["2023",12]]},"citation-key":"oseweSustainableIntensificationFood2023a"}}],"schema":"https://github.com/citation-style-language/schema/raw/master/csl-citation.json"} </w:instrText>
-      </w:r>
-      <w:r>
-        <w:fldChar w:fldCharType="separate"/>
-      </w:r>
-      <w:r>
-        <w:t>Osewe et al. (2023)</w:t>
-      </w:r>
-      <w:r>
-        <w:fldChar w:fldCharType="end"/>
-      </w:r>
-      <w:r>
-        <w:t>,</w:t>
-      </w:r>
-      <w:r>
-        <w:t xml:space="preserve"> using Uganda National Panel Survey data, demonstrated that the joint use of inorganic fertilizer and maize-legume intercropping significantly improves household food security, while maize-legume intercropping alone had negative effects on food security, underscoring the necessity of complementing intercropping with inorganic inputs. Similarly, </w:t>
-      </w:r>
-      <w:r>
-        <w:fldChar w:fldCharType="begin"/>
-      </w:r>
-      <w:r>
-        <w:instrText xml:space="preserve"> ADDIN ZOTERO_ITEM CSL_CITATION {"citationID":"cEoSK0l6","properties":{"custom":"Kim et al. (2019)","formattedCitation":"Kim et al. (2019)","plainCitation":"Kim et al. (2019)","noteIndex":0},"citationItems":[{"id":1926,"uris":["http://zotero.org/groups/5881550/items/KRVC27ZT"],"itemData":{"id":1926,"type":"article-journal","abstract":"Abstract\n            Food insecurity, child malnutrition, and land degradation remain persistent problems in sub</w:instrText>
-      </w:r>
-      <w:r>
-        <w:rPr>
-          <w:rFonts w:ascii="Cambria Math" w:hAnsi="Cambria Math" w:cs="Cambria Math"/>
-        </w:rPr>
-        <w:instrText>‐</w:instrText>
-      </w:r>
-      <w:r>
-        <w:instrText>Saharan Africa. Agricultural sustainable intensification (SI) has been proposed as a possible solution to simultaneously address these challenges. Yet there is little empirical evidence on if agricultural management practices and inputs that contribute to SI from an environmental standpoint do indeed improve food security or child nutrition. We use three waves of data from the nationally</w:instrText>
-      </w:r>
-      <w:r>
-        <w:rPr>
-          <w:rFonts w:ascii="Cambria Math" w:hAnsi="Cambria Math" w:cs="Cambria Math"/>
-        </w:rPr>
-        <w:instrText>‐</w:instrText>
-      </w:r>
-      <w:r>
-        <w:instrText>representative Tanzania National Panel Survey to analyze the child nutrition effects of rural households</w:instrText>
-      </w:r>
-      <w:r>
-        <w:rPr>
-          <w:rFonts w:cs="Georgia"/>
-        </w:rPr>
-        <w:instrText>’</w:instrText>
-      </w:r>
-      <w:r>
-        <w:instrText xml:space="preserve"> adoption of farming practices that can contribute to the SI of maize production. We group households into four categories based on their use of three soil fertility management practices on their maize plots: “Nonadoption”; “Intensification” (use of inorganic fertilizer only); “Sustainable” (use of organic fertilizer, maize–legume intercropping, or both); and “SI” (joint use of inorganic fertilizer with organic fertilizer and/or maize–legume intercropping). The results from multinomial endogenous treatment effects models with the Mundlak–Chamberlain device suggest that use of practices in the “SI” category is associated with improvements in children's height</w:instrText>
-      </w:r>
-      <w:r>
-        <w:rPr>
-          <w:rFonts w:ascii="Cambria Math" w:hAnsi="Cambria Math" w:cs="Cambria Math"/>
-        </w:rPr>
-        <w:instrText>‐</w:instrText>
-      </w:r>
-      <w:r>
-        <w:instrText>for</w:instrText>
-      </w:r>
-      <w:r>
-        <w:rPr>
-          <w:rFonts w:ascii="Cambria Math" w:hAnsi="Cambria Math" w:cs="Cambria Math"/>
-        </w:rPr>
-        <w:instrText>‐</w:instrText>
-      </w:r>
-      <w:r>
-        <w:instrText>age and weight</w:instrText>
-      </w:r>
-      <w:r>
-        <w:rPr>
-          <w:rFonts w:ascii="Cambria Math" w:hAnsi="Cambria Math" w:cs="Cambria Math"/>
-        </w:rPr>
-        <w:instrText>‐</w:instrText>
-      </w:r>
-      <w:r>
-        <w:instrText>for</w:instrText>
-      </w:r>
-      <w:r>
-        <w:rPr>
-          <w:rFonts w:ascii="Cambria Math" w:hAnsi="Cambria Math" w:cs="Cambria Math"/>
-        </w:rPr>
-        <w:instrText>‐</w:instrText>
-      </w:r>
-      <w:r>
-        <w:instrText>age z</w:instrText>
-      </w:r>
-      <w:r>
-        <w:rPr>
-          <w:rFonts w:ascii="Cambria Math" w:hAnsi="Cambria Math" w:cs="Cambria Math"/>
-        </w:rPr>
-        <w:instrText>‐</w:instrText>
-      </w:r>
-      <w:r>
-        <w:instrText xml:space="preserve">scores relative to </w:instrText>
-      </w:r>
-      <w:r>
-        <w:rPr>
-          <w:rFonts w:cs="Georgia"/>
-        </w:rPr>
-        <w:instrText>“</w:instrText>
-      </w:r>
-      <w:r>
-        <w:instrText>Nonadoption,</w:instrText>
-      </w:r>
-      <w:r>
-        <w:rPr>
-          <w:rFonts w:cs="Georgia"/>
-        </w:rPr>
-        <w:instrText>”</w:instrText>
-      </w:r>
-      <w:r>
-        <w:instrText xml:space="preserve"> particularly for children aged 25</w:instrText>
-      </w:r>
-      <w:r>
-        <w:rPr>
-          <w:rFonts w:cs="Georgia"/>
-        </w:rPr>
-        <w:instrText>–</w:instrText>
-      </w:r>
-      <w:r>
-        <w:instrText xml:space="preserve">59 months. These effects appear to come through improvements in both crop income and productivity.","container-title":"Agricultural Economics","DOI":"10.1111/agec.12520","ISSN":"0169-5150, 1574-0862","issue":"6","journalAbbreviation":"Agricultural Economics","language":"en","page":"723-734","source":"DOI.org (Crossref)","title":"Does sustainable intensification of maize production enhance child nutrition? Evidence from rural Tanzania","title-short":"Does sustainable intensification of maize production enhance child nutrition?","volume":"50","author":[{"family":"Kim","given":"Jongwoo"},{"family":"Mason","given":"Nicole M."},{"family":"Snapp","given":"Sieglinde"},{"family":"Wu","given":"Felicia"}],"issued":{"date-parts":[["2019",11]]},"citation-key":"kimDoesSustainableIntensification2019"}}],"schema":"https://github.com/citation-style-language/schema/raw/master/csl-citation.json"} </w:instrText>
-      </w:r>
-      <w:r>
-        <w:fldChar w:fldCharType="separate"/>
-      </w:r>
-      <w:r>
-        <w:t>Kim et al. (2019)</w:t>
-      </w:r>
-      <w:r>
-        <w:fldChar w:fldCharType="end"/>
-      </w:r>
-      <w:r>
-        <w:t xml:space="preserve"> </w:t>
-      </w:r>
-      <w:r>
-        <w:t xml:space="preserve">found that the combined use of inorganic fertilizer with maize-legume intercropping was associated with improved child nutrition in Tanzania, reinforcing the importance of integrating inorganic fertilizer into intercropping systems. </w:t>
-      </w:r>
-      <w:r>
-        <w:fldChar w:fldCharType="begin"/>
-      </w:r>
-      <w:r>
-        <w:instrText xml:space="preserve"> ADDIN ZOTERO_ITEM CSL_CITATION {"citationID":"z6iG1fue","properties":{"custom":"Azzarri et al. (2022)","formattedCitation":"Azzarri et al. (2022)","plainCitation":"Azzarri et al. (2022)","noteIndex":0},"citationItems":[{"id":1924,"uris":["http://zotero.org/groups/5881550/items/DE5ZKIHK"],"itemData":{"id":1924,"type":"article-journal","abstract":"We examine the association between on-farm production diversity on household dietary diversity in Malawi using microdata collected as part of an environmentally sustainable agricultural intensification program. The program primarily focuses on the integration of legumes into the cropping system through maize-legume intercropping and legume-legume intercropping. Relative to staple cereals such as maize, legumes are rich in micronutrients, contain better-quality protein, and lead to nitrogen fixation. Given the systematic difference we document between program beneficiaries and randomly sampled non-beneficiary (control) households, we employ causal instrumental variables mediation analysis to account for non-random selection and possible simultaneity between production and consumption decisions. We find a significant positive treatment effect on dietary diversity, led by an increase in production diversity. Analysis of potential pathways show that effects on dietary diversity stem mostly from consumption of diverse food items purchased from the market made possible through higher agricultural income. These findings highlight that, while increasing production for markets can enhance dietary diversity through higher income that would make affordable an expanded set of food items, the production of more nutritious crops such as pulses may not necessarily translate into greater own consumption. This may be due to the persistence of dietary habits, tastes, or other local factors that favor consumption of staples such as maize and encourage sales of more profitable and nutritious food items such as pulses. Pulses are a more affordable and environmentally sustainable source of protein than animal source food, and efforts should be made to enhance their nutritional awareness and contribution to sustainable food systems and healthier diets.","container-title":"PLOS ONE","DOI":"10.1371/journal.pone.0265947","ISSN":"1932-6203","issue":"3","journalAbbreviation":"PLoS ONE","language":"en","page":"e0265947","source":"DOI.org (Crossref)","title":"Plant different, eat different? Insights from participatory agricultural research","title-short":"Plant different, eat different?","volume":"17","author":[{"family":"Azzarri","given":"Carlo"},{"family":"Haile","given":"Beliyou"},{"family":"Letta","given":"Marco"}],"editor":[{"family":"Kruseman","given":"Gideon"}],"issued":{"date-parts":[["2022",3,25]]},"citation-key":"azzarriPlantDifferentEat2022"}}],"schema":"https://github.com/citation-style-language/schema/raw/master/csl-citation.json"} </w:instrText>
-      </w:r>
-      <w:r>
-        <w:fldChar w:fldCharType="separate"/>
-      </w:r>
-      <w:r>
-        <w:t>Azzarri et al. (2022)</w:t>
-      </w:r>
-      <w:r>
-        <w:fldChar w:fldCharType="end"/>
-      </w:r>
-      <w:r>
-        <w:t xml:space="preserve"> evaluated an agricultural intensification program integrating pulses into maize production systems in Malawi and found positive impacts on dietary diversity, primarily driven by increased income from maize production. However, </w:t>
-      </w:r>
-      <w:r>
-        <w:t>in</w:t>
-      </w:r>
-      <w:r>
-        <w:t xml:space="preserve"> another study</w:t>
-      </w:r>
-      <w:r>
-        <w:t xml:space="preserve"> from Tanzania</w:t>
-      </w:r>
-      <w:r>
-        <w:t xml:space="preserve">, </w:t>
-      </w:r>
-      <w:r>
-        <w:fldChar w:fldCharType="begin"/>
-      </w:r>
-      <w:r>
-        <w:instrText xml:space="preserve"> ADDIN ZOTERO_ITEM CSL_CITATION {"citationID":"qQZTcV69","properties":{"custom":"Santalucia and Sibhatu (2024)","formattedCitation":"Santalucia and Sibhatu (2024)","plainCitation":"Santalucia and Sibhatu (2024)","noteIndex":0},"citationItems":[{"id":1903,"uris":["http://zotero.org/groups/5881550/items/5XXZIV5X"],"itemData":{"id":1903,"type":"article-journal","abstract":"Climate-smart agricultural (CSA) practices are increasingly being promoted as nature-based solutions to improve the livelihoods of smallholder farm households amid a sharp increase in climate-change anomalies. However, the extent to which CSA practices contribute to smallholder food security and dietary diversity remains unclear. In this study, we use panel and nationally representative data from Tanzania to examine the association between two climate-smart agricultural practices, namely, improved maize varieties and maize-legume intercropping, and food security in smallholder farm households. We use maize yield per acre, adult-equivalent food expenditure, and household dietary diversity scores to measure household food security, representing three of the four food security pillars: availability, access, and utilization. We also examine the complementarity and potential advantages of combining improved maize seeds with fertilizers. Using standard panel data estimation approaches, we find a positive association between the adoption of improved maize varieties and maize-legume intercropping and an increase in food production measured through higher crop productivity. However, we do not find a corresponding improvement in household dietary diversity or increased food expenditure, despite the higher crop production. Several factors might explain this outcome, including the challenges faced by farmers in accessing markets to sell surplus produce, the influence of established dietary habits, gender issues, and other local factors that promote the consumption of cereal-based foods such as maize. Our findings suggest that CSA practices may help improve food production and availability, but more effort is needed to translate increased food production into improved dietary diversity and better food security among smallholder farmers in sub-Saharan Africa. [EconLit Citations: C23, D12, D13, D24, Q12, Q16, Q18, Q54]. © 2023 The Authors. Agribusiness published by Wiley Periodicals LLC.","container-title":"Agribusiness","DOI":"10.1002/agr.21892","ISSN":"0742-4477","issue":"2","journalAbbreviation":"Agribusiness","language":"English","note":"publisher: John Wiley and Sons Inc","page":"513-533","source":"Scopus","title":"Nourishing the farms, nourishing the plates: Association of climate-smart agricultural practices with household dietary diversity and food security in smallholders","title-short":"Nourishing the farms, nourishing the plates","volume":"40","author":[{"family":"Santalucia","given":"Simone"},{"family":"Sibhatu","given":"Kibrom T."}],"issued":{"date-parts":[["2024"]]},"citation-key":"santaluciaNourishingFarmsNourishing2024"}}],"schema":"https://github.com/citation-style-language/schema/raw/master/csl-citation.json"} </w:instrText>
-      </w:r>
-      <w:r>
-        <w:fldChar w:fldCharType="separate"/>
-      </w:r>
-      <w:r>
-        <w:t>Santalucia and Sibhatu (2024)</w:t>
-      </w:r>
-      <w:r>
-        <w:fldChar w:fldCharType="end"/>
-      </w:r>
-      <w:r>
-        <w:t xml:space="preserve"> </w:t>
-      </w:r>
-      <w:r>
-        <w:t>found that despite improvements in maize yields, there was no evidence of impact on dietary diversity or food expenditure, highlighting the complexity of translating agricultural productivity gains into nutrition outcomes.</w:t>
-      </w:r>
-    </w:p>
-    <w:p>
-      <w:r>
-        <w:t>This paper contributes to the literature by examining how gender dynamics influence the adoption and effectiveness of legume-based agroecological intensification practices for food security outcomes among maize-producing smallholder farmers.</w:t>
-      </w:r>
-      <w:r>
-        <w:t xml:space="preserve"> </w:t>
-      </w:r>
-      <w:r>
-        <w:t>Furthermore, we analyze the heterogeneous effects of maize-legume diversification on food security across varying household contexts, specifically examining differences by off-farm income, household wealth, production diversity</w:t>
-      </w:r>
-      <w:r>
-        <w:t>, and inorganic fertilizer application</w:t>
-      </w:r>
-      <w:r>
-        <w:t>.</w:t>
-      </w:r>
-      <w:r>
-        <w:t xml:space="preserve"> </w:t>
-      </w:r>
-    </w:p>
-    <w:p/>
-    <w:p>
-      <w:r>
-        <w:t xml:space="preserve"> </w:t>
+    </w:p>
+    <w:p>
+      <w:r>
+        <w:rPr>
+          <w:highlight w:val="yellow"/>
+        </w:rPr>
+        <w:t>ROAD MAP</w:t>
       </w:r>
     </w:p>
     <w:p>
@@ -827,25 +769,439 @@
         <w:pStyle w:val="Heading1"/>
       </w:pPr>
       <w:r>
-        <w:t>Data and methods</w:t>
-      </w:r>
-    </w:p>
-    <w:p>
-      <w:r>
-        <w:t>Study Area</w:t>
+        <w:t>Background</w:t>
       </w:r>
     </w:p>
     <w:p/>
     <w:p/>
+    <w:p/>
+    <w:p>
+      <w:r>
+        <w:t xml:space="preserve"> </w:t>
+      </w:r>
+    </w:p>
     <w:p>
       <w:pPr>
         <w:pStyle w:val="Heading1"/>
       </w:pPr>
       <w:r>
+        <w:t>Data and methods</w:t>
+      </w:r>
+    </w:p>
+    <w:p>
+      <w:pPr>
+        <w:pStyle w:val="Heading2"/>
+      </w:pPr>
+      <w:r>
+        <w:t>Data</w:t>
+      </w:r>
+    </w:p>
+    <w:p>
+      <w:r>
+        <w:t xml:space="preserve">We employ the World Bank's Living Standards Measurement Study (LSMS) datasets from three sub-Saharan African countries. The data comprise waves 4 and 5 of the Ethiopia Socioeconomic Survey (ESS), four waves of the Integrated Household Panel Survey (IHPS) from Malawi, and the most recent two waves of the Tanzania National Panel Survey (NPS). </w:t>
+      </w:r>
+      <w:r>
+        <w:t xml:space="preserve"> </w:t>
+      </w:r>
+      <w:r>
+        <w:fldChar w:fldCharType="begin"/>
+      </w:r>
+      <w:r>
+        <w:instrText xml:space="preserve"> REF _Ref209686845 \h </w:instrText>
+      </w:r>
+      <w:r>
+        <w:fldChar w:fldCharType="separate"/>
+      </w:r>
+      <w:r>
+        <w:rPr>
+          <w:i/>
+          <w:iCs/>
+        </w:rPr>
+        <w:t>Figure 1</w:t>
+      </w:r>
+      <w:r>
+        <w:fldChar w:fldCharType="end"/>
+      </w:r>
+      <w:r>
+        <w:t xml:space="preserve"> </w:t>
+      </w:r>
+      <w:r>
+        <w:t>illustrates the survey timelines across the three study countries. The two most recent rounds of the Tanzanian NPS constitute refresh panels. ESS4 represents a new panel that is not a continuation of earlier ESS rounds, while ESS5 constitutes the second wave of the panel initiated with ESS4.</w:t>
+      </w:r>
+      <w:r>
+        <w:t xml:space="preserve"> </w:t>
+      </w:r>
+      <w:r>
+        <w:t>We refer to both row datasets from LSMS data catalog and to the harmonized panel</w:t>
+      </w:r>
+      <w:r>
+        <w:t xml:space="preserve"> (HP)</w:t>
+      </w:r>
+      <w:r>
+        <w:t xml:space="preserve"> dataset made available by </w:t>
+      </w:r>
+      <w:r>
+        <w:fldChar w:fldCharType="begin"/>
+      </w:r>
+      <w:r>
+        <w:instrText xml:space="preserve"> ADDIN ZOTERO_ITEM CSL_CITATION {"citationID":"AJEgyV96","properties":{"custom":"Bentze and Wollburg (2024)","formattedCitation":"Bentze and Wollburg (2024)","plainCitation":"Bentze and Wollburg (2024)","noteIndex":0},"citationItems":[{"id":2111,"uris":["http://zotero.org/groups/5881550/items/DYPBP5RU"],"itemData":{"id":2111,"type":"document","abstract":"A Longitudinal Cross-Country Dataset on Agricultural Productivity and Welfare in Sub-Saharan Africa (English)","language":"en","publisher":"World Bank Group","title":"A Longitudinal Cross-Country Dataset on Agricultural Productivity and Welfare in Sub-Saharan Africa","URL":"http://documents.worldbank.org/curated/en/099422411182437399","author":[{"family":"Bentze","given":"Thomas Patrick"},{"family":"Wollburg","given":"Philip Randolp"}],"accessed":{"date-parts":[["2025",9,25]]},"issued":{"date-parts":[["2024",11,18]]},"citation-key":"bentzeLongitudinalCrossCountryDataset2024"}}],"schema":"https://github.com/citation-style-language/schema/raw/master/csl-citation.json"} </w:instrText>
+      </w:r>
+      <w:r>
+        <w:fldChar w:fldCharType="separate"/>
+      </w:r>
+      <w:r>
+        <w:t>Bentze and Wollburg (2024)</w:t>
+      </w:r>
+      <w:r>
+        <w:fldChar w:fldCharType="end"/>
+      </w:r>
+      <w:r>
+        <w:t xml:space="preserve">. </w:t>
+      </w:r>
+      <w:r>
+        <w:t>Our analyses only include those farmers who have at least one agricultural plot that is mainly cultivated for maize production</w:t>
+      </w:r>
+      <w:r>
+        <w:rPr>
+          <w:rStyle w:val="FootnoteReference"/>
+        </w:rPr>
+        <w:footnoteReference w:id="2"/>
+      </w:r>
+      <w:r>
+        <w:t>.</w:t>
+      </w:r>
+    </w:p>
+    <w:p>
+      <w:pPr>
+        <w:pStyle w:val="Caption"/>
+        <w:keepNext/>
+        <w:rPr>
+          <w:i w:val="0"/>
+          <w:iCs w:val="0"/>
+          <w:sz w:val="20"/>
+          <w:szCs w:val="20"/>
+        </w:rPr>
+      </w:pPr>
+      <w:bookmarkStart w:id="0" w:name="_Ref209686845"/>
+      <w:r>
+        <w:rPr>
+          <w:i w:val="0"/>
+          <w:iCs w:val="0"/>
+          <w:sz w:val="20"/>
+          <w:szCs w:val="20"/>
+        </w:rPr>
+        <w:t xml:space="preserve">Figure </w:t>
+      </w:r>
+      <w:r>
+        <w:rPr>
+          <w:i w:val="0"/>
+          <w:iCs w:val="0"/>
+          <w:sz w:val="20"/>
+          <w:szCs w:val="20"/>
+        </w:rPr>
+        <w:fldChar w:fldCharType="begin"/>
+      </w:r>
+      <w:r>
+        <w:rPr>
+          <w:i w:val="0"/>
+          <w:iCs w:val="0"/>
+          <w:sz w:val="20"/>
+          <w:szCs w:val="20"/>
+        </w:rPr>
+        <w:instrText xml:space="preserve"> SEQ Figure \* ARABIC </w:instrText>
+      </w:r>
+      <w:r>
+        <w:rPr>
+          <w:i w:val="0"/>
+          <w:iCs w:val="0"/>
+          <w:sz w:val="20"/>
+          <w:szCs w:val="20"/>
+        </w:rPr>
+        <w:fldChar w:fldCharType="separate"/>
+      </w:r>
+      <w:r>
+        <w:rPr>
+          <w:i w:val="0"/>
+          <w:iCs w:val="0"/>
+          <w:sz w:val="20"/>
+          <w:szCs w:val="20"/>
+        </w:rPr>
+        <w:t>1</w:t>
+      </w:r>
+      <w:r>
+        <w:rPr>
+          <w:i w:val="0"/>
+          <w:iCs w:val="0"/>
+          <w:sz w:val="20"/>
+          <w:szCs w:val="20"/>
+        </w:rPr>
+        <w:fldChar w:fldCharType="end"/>
+      </w:r>
+      <w:bookmarkEnd w:id="0"/>
+      <w:r>
+        <w:rPr>
+          <w:i w:val="0"/>
+          <w:iCs w:val="0"/>
+          <w:sz w:val="20"/>
+          <w:szCs w:val="20"/>
+        </w:rPr>
+        <w:t>. Timeline of the employed LSMS datasets</w:t>
+      </w:r>
+    </w:p>
+    <w:p>
+      <w:r>
+        <w:rPr>
+          <w:noProof/>
+        </w:rPr>
+        <w:drawing>
+          <wp:inline distT="0" distB="0" distL="0" distR="0" wp14:anchorId="2D7C878F" wp14:editId="3582C455">
+            <wp:extent cx="5731510" cy="2005965"/>
+            <wp:effectExtent l="0" t="0" r="2540" b="0"/>
+            <wp:docPr id="1225404390" name="Picture 4" descr="A screenshot of a graph&#10;&#10;AI-generated content may be incorrect."/>
+            <wp:cNvGraphicFramePr>
+              <a:graphicFrameLocks xmlns:a="http://schemas.openxmlformats.org/drawingml/2006/main" noChangeAspect="1"/>
+            </wp:cNvGraphicFramePr>
+            <a:graphic xmlns:a="http://schemas.openxmlformats.org/drawingml/2006/main">
+              <a:graphicData uri="http://schemas.openxmlformats.org/drawingml/2006/picture">
+                <pic:pic xmlns:pic="http://schemas.openxmlformats.org/drawingml/2006/picture">
+                  <pic:nvPicPr>
+                    <pic:cNvPr id="1225404390" name="Picture 4" descr="A screenshot of a graph&#10;&#10;AI-generated content may be incorrect."/>
+                    <pic:cNvPicPr/>
+                  </pic:nvPicPr>
+                  <pic:blipFill>
+                    <a:blip r:embed="rId8" cstate="print">
+                      <a:extLst>
+                        <a:ext uri="{28A0092B-C50C-407E-A947-70E740481C1C}">
+                          <a14:useLocalDpi xmlns:a14="http://schemas.microsoft.com/office/drawing/2010/main" val="0"/>
+                        </a:ext>
+                      </a:extLst>
+                    </a:blip>
+                    <a:stretch>
+                      <a:fillRect/>
+                    </a:stretch>
+                  </pic:blipFill>
+                  <pic:spPr>
+                    <a:xfrm>
+                      <a:off x="0" y="0"/>
+                      <a:ext cx="5731510" cy="2005965"/>
+                    </a:xfrm>
+                    <a:prstGeom prst="rect">
+                      <a:avLst/>
+                    </a:prstGeom>
+                  </pic:spPr>
+                </pic:pic>
+              </a:graphicData>
+            </a:graphic>
+          </wp:inline>
+        </w:drawing>
+      </w:r>
+    </w:p>
+    <w:p>
+      <w:r>
+        <w:t xml:space="preserve">Moreover, using the geocoordinates of the households, we supplement the data with historical rainfall data extracted from the Climate Hazards Group InfraRed Precipitation with Station data. This is a quasi-global rainfall dataset that incorporates 0.05° resolution satellite imagery with in-situ station data to create gridded precipitation data </w:t>
+      </w:r>
+      <w:r>
+        <w:fldChar w:fldCharType="begin"/>
+      </w:r>
+      <w:r>
+        <w:instrText xml:space="preserve"> ADDIN ZOTERO_ITEM CSL_CITATION {"citationID":"7F3janod","properties":{"formattedCitation":"(Funk et al., 2015)","plainCitation":"(Funk et al., 2015)","noteIndex":0},"citationItems":[{"id":733,"uris":["http://zotero.org/users/9412238/items/P9VWZCPN"],"itemData":{"id":733,"type":"article-journal","abstract":"The Climate Hazards group Infrared Precipitation with Stations (CHIRPS) dataset builds on previous approaches to 'smart' interpolation techniques and high resolution, long period of record precipitation estimates based on infrared Cold Cloud Duration (CCD) observations. The algorithm i) is built around a 0.05° climatology that incorporates satellite information to represent sparsely gauged locations, ii) incorporates daily, pentadal, and monthly 1981-present 0.05° CCD-based precipitation estimates, iii) blends station data to produce a preliminary information product with a latency of about 2 days and a final product with an average latency of about 3 weeks, and iv) uses a novel blending procedure incorporating the spatial correlation structure of CCD-estimates to assign interpolation weights. We present the CHIRPS algorithm, global and regional validation results, and show how CHIRPS can be used to quantify the hydrologic impacts of decreasing precipitation and rising air temperatures in the Greater Horn of Africa. Using the Variable Infiltration Capacity model, we show that CHIRPS can support effective hydrologic forecasts and trend analyses in southeastern Ethiopia.","container-title":"Scientific Data","DOI":"10.1038/sdata.2015.66","ISSN":"2052-4463","issue":"1","journalAbbreviation":"Sci Data","language":"eng","note":"publisher: Nature Publishing Group","page":"150066","title":"The climate hazards infrared precipitation with stations--a new environmental record for monitoring extremes","volume":"2","author":[{"family":"Funk","given":"Chris"},{"family":"Peterson","given":"Pete"},{"family":"Landsfeld","given":"Martin"},{"family":"Pedreros","given":"Diego"},{"family":"Verdin","given":"James"},{"family":"Shukla","given":"Shraddhanand"},{"family":"Husak","given":"Gregory"},{"family":"Rowland","given":"James"},{"family":"Harrison","given":"Laura"},{"family":"Hoell","given":"Andrew"},{"family":"Michaelsen","given":"Joel"}],"issued":{"date-parts":[["2015"]]},"citation-key":"funkClimateHazardsInfrared2015"}}],"schema":"https://github.com/citation-style-language/schema/raw/master/csl-citation.json"} </w:instrText>
+      </w:r>
+      <w:r>
+        <w:fldChar w:fldCharType="separate"/>
+      </w:r>
+      <w:r>
+        <w:t>(Funk et al., 2015)</w:t>
+      </w:r>
+      <w:r>
+        <w:fldChar w:fldCharType="end"/>
+      </w:r>
+      <w:r>
+        <w:t xml:space="preserve">. We extract annual rainfall data from 1990 to the survey year for each wave and calculate the historical average rainfall for this period. We also compute the difference between observed seasonal rainfall and the historical </w:t>
+      </w:r>
+      <w:r>
+        <w:lastRenderedPageBreak/>
+        <w:t>average to control for seasonal variation and historical rainfall patterns in our analyses.</w:t>
+      </w:r>
+      <w:r>
+        <w:t xml:space="preserve"> </w:t>
+      </w:r>
+    </w:p>
+    <w:p>
+      <w:pPr>
+        <w:pStyle w:val="Heading2"/>
+      </w:pPr>
+      <w:r>
+        <w:t>Variables and measure</w:t>
+      </w:r>
+      <w:r>
+        <w:t>ment</w:t>
+      </w:r>
+    </w:p>
+    <w:p>
+      <w:r>
+        <w:t>Given that legume-based intensification strategies encompass the integration of legumes into maize production systems through intercropping or crop rotation practices</w:t>
+      </w:r>
+      <w:r>
+        <w:t xml:space="preserve">, we measure legume-based intensification as </w:t>
+      </w:r>
+      <w:r>
+        <w:t xml:space="preserve">a binary variable indicating </w:t>
+      </w:r>
+      <w:r>
+        <w:t>the adoption of legume rotations, maize-legume intercropping, or both.</w:t>
+      </w:r>
+      <w:r>
+        <w:t xml:space="preserve"> </w:t>
+      </w:r>
+      <w:r>
+        <w:t>The prevalence of these practices varies across study countries: crop rotations with legumes are the predominant strategy in Ethiopia, maize-legume intercropping is more commonly adopted in Tanzania,</w:t>
+      </w:r>
+      <w:r>
+        <w:t xml:space="preserve"> </w:t>
+      </w:r>
+      <w:r>
+        <w:t xml:space="preserve">while both practices are observed among maize farmers in Malawi. Since households may cultivate maize across multiple plots, we employ a standardized selection procedure to identify the focal plot for analysis. For plot and farm manager characteristics, we select the largest plot among those where legume-based intensification is practiced. Specifically, in Tanzania and Malawi, we identify the largest legume-intercropped plot and record whether legume rotation is implemented on this intercropped plot or any other maize plot within the household. In Ethiopia, given </w:t>
+      </w:r>
+      <w:r>
+        <w:t>that rotation is a more common practice than intercropping</w:t>
+      </w:r>
+      <w:r>
+        <w:t>, we select the largest legume-rotated plot and document whether any maize plot within the household employs legume intercropping.</w:t>
+      </w:r>
+    </w:p>
+    <w:p>
+      <w:r>
+        <w:t>Our first research objective examines gender differences in the adoption of legume-based intensification strategies. We operationalize gender through the sex of the plot manager, specifically focusing on the manager of the focal plot identified through our selection procedure: the largest maize plot with legume intercropping in Tanzania and Malawi, or the largest plot with legume rotation in Ethiopia</w:t>
+      </w:r>
+      <w:r>
+        <w:t xml:space="preserve">, as described earlier. </w:t>
+      </w:r>
+      <w:r>
+        <w:t>To validate this approach, we examine decision-making authority at the plot level by identifying the primary decision-maker for key agricultural choices, including crop selection, input application, and cropping schedules. Our analysis reveals that plot managers typically serve as the principal decision-makers for cropping activities on their respective plots</w:t>
+      </w:r>
+      <w:r>
+        <w:rPr>
+          <w:rStyle w:val="FootnoteReference"/>
+        </w:rPr>
+        <w:footnoteReference w:id="3"/>
+      </w:r>
+      <w:r>
+        <w:t xml:space="preserve">. This correspondence between management responsibility and decision-making authority supports our assumption that the gender of the plot manager constitutes a critical determinant of agricultural production decisions, </w:t>
+      </w:r>
+      <w:r>
+        <w:lastRenderedPageBreak/>
+        <w:t>including the adoption of legume-based intensification practices.</w:t>
+      </w:r>
+      <w:r>
+        <w:t xml:space="preserve"> </w:t>
+      </w:r>
+      <w:r>
+        <w:t xml:space="preserve">Moreover, women’s control over income has implications for empowerment, nutrition, and investment in crops that are important for women and </w:t>
+      </w:r>
+      <w:r>
+        <w:t>household nutrition</w:t>
+      </w:r>
+      <w:r>
+        <w:t xml:space="preserve"> </w:t>
+      </w:r>
+      <w:r>
+        <w:fldChar w:fldCharType="begin"/>
+      </w:r>
+      <w:r>
+        <w:instrText xml:space="preserve"> ADDIN ZOTERO_ITEM CSL_CITATION {"citationID":"3CX4bo7Q","properties":{"formattedCitation":"(Quisumbing et al., 2019)","plainCitation":"(Quisumbing et al., 2019)","noteIndex":0},"citationItems":[{"id":2118,"uris":["http://zotero.org/groups/5881550/items/52AFNKSY"],"itemData":{"id":2118,"type":"book","abstract":"Gender-sensitive policy and programming have an integral role to play in fostering inclusive agricultural growth to meet the commitments of African countries to the Malabo Declaration goals. The 2019 Annual Trends and Outlook Report from ReSAKSS applies a gender lens to key issues that must be addressed to fully achieve these goals. Chapters examine the intersections between gender and (1) the context and institutions within which rural people operate; (2) the natural resources that men and women depend on for agriculture, sources of vulnerability, and resilience to shocks; (3) assets and income; and (4) livelihood strategies and well-being. The report serves as the official M&amp;E report for the Comprehensive Africa Agriculture Development Programme (CAADP), tracking progress on over 30 CAADP indicators. This record also includes the following synopsis, which has also been translated into French: Quisumbing, Agnes R.; Meinzen-Dick, Ruth Suseela; and Njuki, Jemimah. 2019. 2019 Annual trends and outlook report: Gender equality in rural Africa: From commitments to outcomes: Synopsis. Washington, DC: International Food Policy Research Institute (IFPRI). https://doi.org/10.2499/9780896293656 Quisumbing, Agnes R.; Meinzen-Dick, Ruth Suseela; and Njuki, Jemimah. 2019. Rapport annuel 2019 sur les tendances et les perspectives Égalité des genres en Afrique rurale : des engagements aux résultats: Synopsis. Washington, DC: International Food Policy Research Institute (IFPRI). https://doi.org/10.2499/9780896293663","ISBN":"978-0-89629-364-9","language":"en","note":"DOI: 10.2499/9780896293649","publisher":"International Food Policy Research Institute","source":"cgspace.cgiar.org","title":"2019 Annual trends and outlook report: Gender equality in rural Africa: From commitments to outcomes","title-short":"2019 Annual trends and outlook report","URL":"https://doi.org/10.2499/9780896293663","author":[{"family":"Quisumbing","given":"Agnes R."},{"family":"Meinzen-Dick","given":"Ruth S."},{"family":"Njuki","given":"Jemimah"}],"accessed":{"date-parts":[["2025",9,26]]},"issued":{"date-parts":[["2019",10,31]]},"citation-key":"quisumbing2019AnnualTrends2019"}}],"schema":"https://github.com/citation-style-language/schema/raw/master/csl-citation.json"} </w:instrText>
+      </w:r>
+      <w:r>
+        <w:fldChar w:fldCharType="separate"/>
+      </w:r>
+      <w:r>
+        <w:t>(Quisumbing et al., 2019)</w:t>
+      </w:r>
+      <w:r>
+        <w:fldChar w:fldCharType="end"/>
+      </w:r>
+      <w:r>
+        <w:t xml:space="preserve">. </w:t>
+      </w:r>
+      <w:r>
+        <w:rPr>
+          <w:highlight w:val="yellow"/>
+        </w:rPr>
+        <w:t>Considering that legumes are often considered women’s crops, we also investigate the association between women’s control over crop income, legume intensification, and food security</w:t>
+      </w:r>
+      <w:r>
+        <w:t xml:space="preserve">. </w:t>
+      </w:r>
+      <w:r>
+        <w:t xml:space="preserve">Control over crop income is measured as a </w:t>
+      </w:r>
+      <w:r>
+        <w:t xml:space="preserve">joint, male, or female decision-making over crop income. </w:t>
+      </w:r>
+    </w:p>
+    <w:p/>
+    <w:p/>
+    <w:p/>
+    <w:p>
+      <w:pPr>
+        <w:pStyle w:val="Heading1"/>
+      </w:pPr>
+      <w:r>
         <w:t>Results</w:t>
       </w:r>
     </w:p>
     <w:p/>
+    <w:p/>
+    <w:p>
+      <w:r>
+        <w:rPr>
+          <w:noProof/>
+        </w:rPr>
+        <w:drawing>
+          <wp:inline distT="0" distB="0" distL="0" distR="0" wp14:anchorId="26126FDB" wp14:editId="1EAFE73C">
+            <wp:extent cx="5731510" cy="2865120"/>
+            <wp:effectExtent l="0" t="0" r="2540" b="0"/>
+            <wp:docPr id="1131906003" name="Picture 11" descr="A graph of different colored bars&#10;&#10;AI-generated content may be incorrect."/>
+            <wp:cNvGraphicFramePr>
+              <a:graphicFrameLocks xmlns:a="http://schemas.openxmlformats.org/drawingml/2006/main" noChangeAspect="1"/>
+            </wp:cNvGraphicFramePr>
+            <a:graphic xmlns:a="http://schemas.openxmlformats.org/drawingml/2006/main">
+              <a:graphicData uri="http://schemas.openxmlformats.org/drawingml/2006/picture">
+                <pic:pic xmlns:pic="http://schemas.openxmlformats.org/drawingml/2006/picture">
+                  <pic:nvPicPr>
+                    <pic:cNvPr id="1131906003" name="Picture 11" descr="A graph of different colored bars&#10;&#10;AI-generated content may be incorrect."/>
+                    <pic:cNvPicPr/>
+                  </pic:nvPicPr>
+                  <pic:blipFill>
+                    <a:blip r:embed="rId9" cstate="print">
+                      <a:extLst>
+                        <a:ext uri="{28A0092B-C50C-407E-A947-70E740481C1C}">
+                          <a14:useLocalDpi xmlns:a14="http://schemas.microsoft.com/office/drawing/2010/main" val="0"/>
+                        </a:ext>
+                      </a:extLst>
+                    </a:blip>
+                    <a:stretch>
+                      <a:fillRect/>
+                    </a:stretch>
+                  </pic:blipFill>
+                  <pic:spPr>
+                    <a:xfrm>
+                      <a:off x="0" y="0"/>
+                      <a:ext cx="5731510" cy="2865120"/>
+                    </a:xfrm>
+                    <a:prstGeom prst="rect">
+                      <a:avLst/>
+                    </a:prstGeom>
+                  </pic:spPr>
+                </pic:pic>
+              </a:graphicData>
+            </a:graphic>
+          </wp:inline>
+        </w:drawing>
+      </w:r>
+    </w:p>
+    <w:p/>
+    <w:p/>
+    <w:p/>
     <w:p>
       <w:pPr>
         <w:pStyle w:val="Heading1"/>
@@ -860,6 +1216,7 @@
         <w:pStyle w:val="Heading1"/>
       </w:pPr>
       <w:r>
+        <w:lastRenderedPageBreak/>
         <w:t>Conclusion</w:t>
       </w:r>
     </w:p>
@@ -943,10 +1300,7 @@
         <w:footnoteRef/>
       </w:r>
       <w:r>
-        <w:t xml:space="preserve"> Scopus </w:t>
-      </w:r>
-      <w:r>
-        <w:t>"maize-legume" AND ( "food security" OR protein )</w:t>
+        <w:t xml:space="preserve"> Scopus "maize-legume" AND ( "food security" OR protein )</w:t>
       </w:r>
       <w:r>
         <w:t xml:space="preserve">” </w:t>
@@ -962,6 +1316,53 @@
       </w:r>
       <w:r>
         <w:t xml:space="preserve">ry provides 61 articles of which only four are relevant.  </w:t>
+      </w:r>
+    </w:p>
+  </w:footnote>
+  <w:footnote w:id="2">
+    <w:p>
+      <w:pPr>
+        <w:pStyle w:val="FootnoteText"/>
+      </w:pPr>
+      <w:r>
+        <w:rPr>
+          <w:rStyle w:val="FootnoteReference"/>
+        </w:rPr>
+        <w:footnoteRef/>
+      </w:r>
+      <w:r>
+        <w:t xml:space="preserve"> Where maize is  the highest value crop on the plot </w:t>
+      </w:r>
+      <w:r>
+        <w:fldChar w:fldCharType="begin"/>
+      </w:r>
+      <w:r>
+        <w:instrText xml:space="preserve"> ADDIN ZOTERO_ITEM CSL_CITATION {"citationID":"OvupHeA3","properties":{"formattedCitation":"(Bentze &amp; Wollburg, 2024)","plainCitation":"(Bentze &amp; Wollburg, 2024)","noteIndex":2},"citationItems":[{"id":2111,"uris":["http://zotero.org/groups/5881550/items/DYPBP5RU"],"itemData":{"id":2111,"type":"document","abstract":"A Longitudinal Cross-Country Dataset on Agricultural Productivity and Welfare in Sub-Saharan Africa (English)","language":"en","publisher":"World Bank Group","title":"A Longitudinal Cross-Country Dataset on Agricultural Productivity and Welfare in Sub-Saharan Africa","URL":"http://documents.worldbank.org/curated/en/099422411182437399","author":[{"family":"Bentze","given":"Thomas Patrick"},{"family":"Wollburg","given":"Philip Randolp"}],"accessed":{"date-parts":[["2025",9,25]]},"issued":{"date-parts":[["2024",11,18]]},"citation-key":"bentzeLongitudinalCrossCountryDataset2024"}}],"schema":"https://github.com/citation-style-language/schema/raw/master/csl-citation.json"} </w:instrText>
+      </w:r>
+      <w:r>
+        <w:fldChar w:fldCharType="separate"/>
+      </w:r>
+      <w:r>
+        <w:t>(Bentze &amp; Wollburg, 2024)</w:t>
+      </w:r>
+      <w:r>
+        <w:fldChar w:fldCharType="end"/>
+      </w:r>
+    </w:p>
+  </w:footnote>
+  <w:footnote w:id="3">
+    <w:p>
+      <w:pPr>
+        <w:pStyle w:val="FootnoteText"/>
+      </w:pPr>
+      <w:r>
+        <w:rPr>
+          <w:rStyle w:val="FootnoteReference"/>
+        </w:rPr>
+        <w:footnoteRef/>
+      </w:r>
+      <w:r>
+        <w:t xml:space="preserve"> There are very few cases (&lt; 1%) only in Tanzania where the plot manager and decision-maker are different members. </w:t>
       </w:r>
     </w:p>
   </w:footnote>
@@ -971,10 +1372,182 @@
 <file path=word/numbering.xml><?xml version="1.0" encoding="utf-8"?>
 <w:numbering xmlns:wpc="http://schemas.microsoft.com/office/word/2010/wordprocessingCanvas" xmlns:cx="http://schemas.microsoft.com/office/drawing/2014/chartex" xmlns:cx1="http://schemas.microsoft.com/office/drawing/2015/9/8/chartex" xmlns:cx2="http://schemas.microsoft.com/office/drawing/2015/10/21/chartex" xmlns:cx3="http://schemas.microsoft.com/office/drawing/2016/5/9/chartex" xmlns:cx4="http://schemas.microsoft.com/office/drawing/2016/5/10/chartex" xmlns:cx5="http://schemas.microsoft.com/office/drawing/2016/5/11/chartex" xmlns:cx6="http://schemas.microsoft.com/office/drawing/2016/5/12/chartex" xmlns:cx7="http://schemas.microsoft.com/office/drawing/2016/5/13/chartex" xmlns:cx8="http://schemas.microsoft.com/office/drawing/2016/5/14/chartex" xmlns:mc="http://schemas.openxmlformats.org/markup-compatibility/2006" xmlns:aink="http://schemas.microsoft.com/office/drawing/2016/ink" xmlns:am3d="http://schemas.microsoft.com/office/drawing/2017/model3d" xmlns:o="urn:schemas-microsoft-com:office:office" xmlns:oel="http://schemas.microsoft.com/office/2019/extlst" xmlns:r="http://schemas.openxmlformats.org/officeDocument/2006/relationships" xmlns:m="http://schemas.openxmlformats.org/officeDocument/2006/math" xmlns:v="urn:schemas-microsoft-com:vml" xmlns:wp14="http://schemas.microsoft.com/office/word/2010/wordprocessingDrawing" xmlns:wp="http://schemas.openxmlformats.org/drawingml/2006/wordprocessingDrawing" xmlns:w10="urn:schemas-microsoft-com:office:word" xmlns:w="http://schemas.openxmlformats.org/wordprocessingml/2006/main" xmlns:w14="http://schemas.microsoft.com/office/word/2010/wordml" xmlns:w15="http://schemas.microsoft.com/office/word/2012/wordml" xmlns:w16cex="http://schemas.microsoft.com/office/word/2018/wordml/cex" xmlns:w16cid="http://schemas.microsoft.com/office/word/2016/wordml/cid" xmlns:w16="http://schemas.microsoft.com/office/word/2018/wordml" xmlns:w16du="http://schemas.microsoft.com/office/word/2023/wordml/word16du" xmlns:w16sdtdh="http://schemas.microsoft.com/office/word/2020/wordml/sdtdatahash" xmlns:w16sdtfl="http://schemas.microsoft.com/office/word/2024/wordml/sdtformatlock" xmlns:w16se="http://schemas.microsoft.com/office/word/2015/wordml/symex" xmlns:wpg="http://schemas.microsoft.com/office/word/2010/wordprocessingGroup" xmlns:wpi="http://schemas.microsoft.com/office/word/2010/wordprocessingInk" xmlns:wne="http://schemas.microsoft.com/office/word/2006/wordml" xmlns:wps="http://schemas.microsoft.com/office/word/2010/wordprocessingShape" mc:Ignorable="w14 w15 w16se w16cid w16 w16cex w16sdtdh w16sdtfl w16du wp14">
   <w:abstractNum w:abstractNumId="0" w15:restartNumberingAfterBreak="0">
+    <w:nsid w:val="159E7D18"/>
+    <w:multiLevelType w:val="multilevel"/>
+    <w:tmpl w:val="1000001D"/>
+    <w:lvl w:ilvl="0">
+      <w:start w:val="1"/>
+      <w:numFmt w:val="decimal"/>
+      <w:lvlText w:val="%1)"/>
+      <w:lvlJc w:val="left"/>
+      <w:pPr>
+        <w:ind w:left="360" w:hanging="360"/>
+      </w:pPr>
+    </w:lvl>
+    <w:lvl w:ilvl="1">
+      <w:start w:val="1"/>
+      <w:numFmt w:val="lowerLetter"/>
+      <w:lvlText w:val="%2)"/>
+      <w:lvlJc w:val="left"/>
+      <w:pPr>
+        <w:ind w:left="720" w:hanging="360"/>
+      </w:pPr>
+    </w:lvl>
+    <w:lvl w:ilvl="2">
+      <w:start w:val="1"/>
+      <w:numFmt w:val="lowerRoman"/>
+      <w:lvlText w:val="%3)"/>
+      <w:lvlJc w:val="left"/>
+      <w:pPr>
+        <w:ind w:left="1080" w:hanging="360"/>
+      </w:pPr>
+    </w:lvl>
+    <w:lvl w:ilvl="3">
+      <w:start w:val="1"/>
+      <w:numFmt w:val="decimal"/>
+      <w:lvlText w:val="(%4)"/>
+      <w:lvlJc w:val="left"/>
+      <w:pPr>
+        <w:ind w:left="1440" w:hanging="360"/>
+      </w:pPr>
+    </w:lvl>
+    <w:lvl w:ilvl="4">
+      <w:start w:val="1"/>
+      <w:numFmt w:val="lowerLetter"/>
+      <w:lvlText w:val="(%5)"/>
+      <w:lvlJc w:val="left"/>
+      <w:pPr>
+        <w:ind w:left="1800" w:hanging="360"/>
+      </w:pPr>
+    </w:lvl>
+    <w:lvl w:ilvl="5">
+      <w:start w:val="1"/>
+      <w:numFmt w:val="lowerRoman"/>
+      <w:lvlText w:val="(%6)"/>
+      <w:lvlJc w:val="left"/>
+      <w:pPr>
+        <w:ind w:left="2160" w:hanging="360"/>
+      </w:pPr>
+    </w:lvl>
+    <w:lvl w:ilvl="6">
+      <w:start w:val="1"/>
+      <w:numFmt w:val="decimal"/>
+      <w:lvlText w:val="%7."/>
+      <w:lvlJc w:val="left"/>
+      <w:pPr>
+        <w:ind w:left="2520" w:hanging="360"/>
+      </w:pPr>
+    </w:lvl>
+    <w:lvl w:ilvl="7">
+      <w:start w:val="1"/>
+      <w:numFmt w:val="lowerLetter"/>
+      <w:lvlText w:val="%8."/>
+      <w:lvlJc w:val="left"/>
+      <w:pPr>
+        <w:ind w:left="2880" w:hanging="360"/>
+      </w:pPr>
+    </w:lvl>
+    <w:lvl w:ilvl="8">
+      <w:start w:val="1"/>
+      <w:numFmt w:val="lowerRoman"/>
+      <w:lvlText w:val="%9."/>
+      <w:lvlJc w:val="left"/>
+      <w:pPr>
+        <w:ind w:left="3240" w:hanging="360"/>
+      </w:pPr>
+    </w:lvl>
+  </w:abstractNum>
+  <w:abstractNum w:abstractNumId="1" w15:restartNumberingAfterBreak="0">
     <w:nsid w:val="32300FFF"/>
     <w:multiLevelType w:val="hybridMultilevel"/>
-    <w:tmpl w:val="A7CAA282"/>
+    <w:tmpl w:val="F2928F36"/>
     <w:lvl w:ilvl="0" w:tplc="5DBC6DC8">
+      <w:start w:val="1"/>
+      <w:numFmt w:val="decimal"/>
+      <w:lvlText w:val="%1."/>
+      <w:lvlJc w:val="left"/>
+      <w:pPr>
+        <w:ind w:left="720" w:hanging="360"/>
+      </w:pPr>
+    </w:lvl>
+    <w:lvl w:ilvl="1" w:tplc="10000019" w:tentative="1">
+      <w:start w:val="1"/>
+      <w:numFmt w:val="lowerLetter"/>
+      <w:lvlText w:val="%2."/>
+      <w:lvlJc w:val="left"/>
+      <w:pPr>
+        <w:ind w:left="1440" w:hanging="360"/>
+      </w:pPr>
+    </w:lvl>
+    <w:lvl w:ilvl="2" w:tplc="1000001B" w:tentative="1">
+      <w:start w:val="1"/>
+      <w:numFmt w:val="lowerRoman"/>
+      <w:lvlText w:val="%3."/>
+      <w:lvlJc w:val="right"/>
+      <w:pPr>
+        <w:ind w:left="2160" w:hanging="180"/>
+      </w:pPr>
+    </w:lvl>
+    <w:lvl w:ilvl="3" w:tplc="1000000F" w:tentative="1">
+      <w:start w:val="1"/>
+      <w:numFmt w:val="decimal"/>
+      <w:lvlText w:val="%4."/>
+      <w:lvlJc w:val="left"/>
+      <w:pPr>
+        <w:ind w:left="2880" w:hanging="360"/>
+      </w:pPr>
+    </w:lvl>
+    <w:lvl w:ilvl="4" w:tplc="10000019" w:tentative="1">
+      <w:start w:val="1"/>
+      <w:numFmt w:val="lowerLetter"/>
+      <w:lvlText w:val="%5."/>
+      <w:lvlJc w:val="left"/>
+      <w:pPr>
+        <w:ind w:left="3600" w:hanging="360"/>
+      </w:pPr>
+    </w:lvl>
+    <w:lvl w:ilvl="5" w:tplc="1000001B" w:tentative="1">
+      <w:start w:val="1"/>
+      <w:numFmt w:val="lowerRoman"/>
+      <w:lvlText w:val="%6."/>
+      <w:lvlJc w:val="right"/>
+      <w:pPr>
+        <w:ind w:left="4320" w:hanging="180"/>
+      </w:pPr>
+    </w:lvl>
+    <w:lvl w:ilvl="6" w:tplc="1000000F" w:tentative="1">
+      <w:start w:val="1"/>
+      <w:numFmt w:val="decimal"/>
+      <w:lvlText w:val="%7."/>
+      <w:lvlJc w:val="left"/>
+      <w:pPr>
+        <w:ind w:left="5040" w:hanging="360"/>
+      </w:pPr>
+    </w:lvl>
+    <w:lvl w:ilvl="7" w:tplc="10000019" w:tentative="1">
+      <w:start w:val="1"/>
+      <w:numFmt w:val="lowerLetter"/>
+      <w:lvlText w:val="%8."/>
+      <w:lvlJc w:val="left"/>
+      <w:pPr>
+        <w:ind w:left="5760" w:hanging="360"/>
+      </w:pPr>
+    </w:lvl>
+    <w:lvl w:ilvl="8" w:tplc="1000001B" w:tentative="1">
+      <w:start w:val="1"/>
+      <w:numFmt w:val="lowerRoman"/>
+      <w:lvlText w:val="%9."/>
+      <w:lvlJc w:val="right"/>
+      <w:pPr>
+        <w:ind w:left="6480" w:hanging="180"/>
+      </w:pPr>
+    </w:lvl>
+  </w:abstractNum>
+  <w:abstractNum w:abstractNumId="2" w15:restartNumberingAfterBreak="0">
+    <w:nsid w:val="37091727"/>
+    <w:multiLevelType w:val="multilevel"/>
+    <w:tmpl w:val="3ADC83D6"/>
+    <w:lvl w:ilvl="0">
       <w:start w:val="1"/>
       <w:numFmt w:val="decimal"/>
       <w:pStyle w:val="Heading1"/>
@@ -983,17 +1556,24 @@
       <w:pPr>
         <w:ind w:left="720" w:hanging="360"/>
       </w:pPr>
-    </w:lvl>
-    <w:lvl w:ilvl="1" w:tplc="10000019" w:tentative="1">
-      <w:start w:val="1"/>
-      <w:numFmt w:val="lowerLetter"/>
-      <w:lvlText w:val="%2."/>
-      <w:lvlJc w:val="left"/>
-      <w:pPr>
-        <w:ind w:left="1440" w:hanging="360"/>
-      </w:pPr>
-    </w:lvl>
-    <w:lvl w:ilvl="2" w:tplc="1000001B" w:tentative="1">
+      <w:rPr>
+        <w:rFonts w:hint="default"/>
+      </w:rPr>
+    </w:lvl>
+    <w:lvl w:ilvl="1">
+      <w:start w:val="1"/>
+      <w:numFmt w:val="decimal"/>
+      <w:pStyle w:val="Heading2"/>
+      <w:lvlText w:val="%1.%2"/>
+      <w:lvlJc w:val="left"/>
+      <w:pPr>
+        <w:ind w:left="1440" w:hanging="1440"/>
+      </w:pPr>
+      <w:rPr>
+        <w:rFonts w:hint="default"/>
+      </w:rPr>
+    </w:lvl>
+    <w:lvl w:ilvl="2">
       <w:start w:val="1"/>
       <w:numFmt w:val="lowerRoman"/>
       <w:lvlText w:val="%3."/>
@@ -1001,8 +1581,11 @@
       <w:pPr>
         <w:ind w:left="2160" w:hanging="180"/>
       </w:pPr>
-    </w:lvl>
-    <w:lvl w:ilvl="3" w:tplc="1000000F" w:tentative="1">
+      <w:rPr>
+        <w:rFonts w:hint="default"/>
+      </w:rPr>
+    </w:lvl>
+    <w:lvl w:ilvl="3">
       <w:start w:val="1"/>
       <w:numFmt w:val="decimal"/>
       <w:lvlText w:val="%4."/>
@@ -1010,8 +1593,11 @@
       <w:pPr>
         <w:ind w:left="2880" w:hanging="360"/>
       </w:pPr>
-    </w:lvl>
-    <w:lvl w:ilvl="4" w:tplc="10000019" w:tentative="1">
+      <w:rPr>
+        <w:rFonts w:hint="default"/>
+      </w:rPr>
+    </w:lvl>
+    <w:lvl w:ilvl="4">
       <w:start w:val="1"/>
       <w:numFmt w:val="lowerLetter"/>
       <w:lvlText w:val="%5."/>
@@ -1019,8 +1605,11 @@
       <w:pPr>
         <w:ind w:left="3600" w:hanging="360"/>
       </w:pPr>
-    </w:lvl>
-    <w:lvl w:ilvl="5" w:tplc="1000001B" w:tentative="1">
+      <w:rPr>
+        <w:rFonts w:hint="default"/>
+      </w:rPr>
+    </w:lvl>
+    <w:lvl w:ilvl="5">
       <w:start w:val="1"/>
       <w:numFmt w:val="lowerRoman"/>
       <w:lvlText w:val="%6."/>
@@ -1028,8 +1617,11 @@
       <w:pPr>
         <w:ind w:left="4320" w:hanging="180"/>
       </w:pPr>
-    </w:lvl>
-    <w:lvl w:ilvl="6" w:tplc="1000000F" w:tentative="1">
+      <w:rPr>
+        <w:rFonts w:hint="default"/>
+      </w:rPr>
+    </w:lvl>
+    <w:lvl w:ilvl="6">
       <w:start w:val="1"/>
       <w:numFmt w:val="decimal"/>
       <w:lvlText w:val="%7."/>
@@ -1037,8 +1629,11 @@
       <w:pPr>
         <w:ind w:left="5040" w:hanging="360"/>
       </w:pPr>
-    </w:lvl>
-    <w:lvl w:ilvl="7" w:tplc="10000019" w:tentative="1">
+      <w:rPr>
+        <w:rFonts w:hint="default"/>
+      </w:rPr>
+    </w:lvl>
+    <w:lvl w:ilvl="7">
       <w:start w:val="1"/>
       <w:numFmt w:val="lowerLetter"/>
       <w:lvlText w:val="%8."/>
@@ -1046,8 +1641,11 @@
       <w:pPr>
         <w:ind w:left="5760" w:hanging="360"/>
       </w:pPr>
-    </w:lvl>
-    <w:lvl w:ilvl="8" w:tplc="1000001B" w:tentative="1">
+      <w:rPr>
+        <w:rFonts w:hint="default"/>
+      </w:rPr>
+    </w:lvl>
+    <w:lvl w:ilvl="8">
       <w:start w:val="1"/>
       <w:numFmt w:val="lowerRoman"/>
       <w:lvlText w:val="%9."/>
@@ -1055,16 +1653,217 @@
       <w:pPr>
         <w:ind w:left="6480" w:hanging="180"/>
       </w:pPr>
+      <w:rPr>
+        <w:rFonts w:hint="default"/>
+      </w:rPr>
     </w:lvl>
   </w:abstractNum>
-  <w:abstractNum w:abstractNumId="1" w15:restartNumberingAfterBreak="0">
+  <w:abstractNum w:abstractNumId="3" w15:restartNumberingAfterBreak="0">
+    <w:nsid w:val="453C54A5"/>
+    <w:multiLevelType w:val="multilevel"/>
+    <w:tmpl w:val="1000001D"/>
+    <w:lvl w:ilvl="0">
+      <w:start w:val="1"/>
+      <w:numFmt w:val="decimal"/>
+      <w:lvlText w:val="%1)"/>
+      <w:lvlJc w:val="left"/>
+      <w:pPr>
+        <w:ind w:left="360" w:hanging="360"/>
+      </w:pPr>
+    </w:lvl>
+    <w:lvl w:ilvl="1">
+      <w:start w:val="1"/>
+      <w:numFmt w:val="lowerLetter"/>
+      <w:lvlText w:val="%2)"/>
+      <w:lvlJc w:val="left"/>
+      <w:pPr>
+        <w:ind w:left="720" w:hanging="360"/>
+      </w:pPr>
+    </w:lvl>
+    <w:lvl w:ilvl="2">
+      <w:start w:val="1"/>
+      <w:numFmt w:val="lowerRoman"/>
+      <w:lvlText w:val="%3)"/>
+      <w:lvlJc w:val="left"/>
+      <w:pPr>
+        <w:ind w:left="1080" w:hanging="360"/>
+      </w:pPr>
+    </w:lvl>
+    <w:lvl w:ilvl="3">
+      <w:start w:val="1"/>
+      <w:numFmt w:val="decimal"/>
+      <w:lvlText w:val="(%4)"/>
+      <w:lvlJc w:val="left"/>
+      <w:pPr>
+        <w:ind w:left="1440" w:hanging="360"/>
+      </w:pPr>
+    </w:lvl>
+    <w:lvl w:ilvl="4">
+      <w:start w:val="1"/>
+      <w:numFmt w:val="lowerLetter"/>
+      <w:lvlText w:val="(%5)"/>
+      <w:lvlJc w:val="left"/>
+      <w:pPr>
+        <w:ind w:left="1800" w:hanging="360"/>
+      </w:pPr>
+    </w:lvl>
+    <w:lvl w:ilvl="5">
+      <w:start w:val="1"/>
+      <w:numFmt w:val="lowerRoman"/>
+      <w:lvlText w:val="(%6)"/>
+      <w:lvlJc w:val="left"/>
+      <w:pPr>
+        <w:ind w:left="2160" w:hanging="360"/>
+      </w:pPr>
+    </w:lvl>
+    <w:lvl w:ilvl="6">
+      <w:start w:val="1"/>
+      <w:numFmt w:val="decimal"/>
+      <w:lvlText w:val="%7."/>
+      <w:lvlJc w:val="left"/>
+      <w:pPr>
+        <w:ind w:left="2520" w:hanging="360"/>
+      </w:pPr>
+    </w:lvl>
+    <w:lvl w:ilvl="7">
+      <w:start w:val="1"/>
+      <w:numFmt w:val="lowerLetter"/>
+      <w:lvlText w:val="%8."/>
+      <w:lvlJc w:val="left"/>
+      <w:pPr>
+        <w:ind w:left="2880" w:hanging="360"/>
+      </w:pPr>
+    </w:lvl>
+    <w:lvl w:ilvl="8">
+      <w:start w:val="1"/>
+      <w:numFmt w:val="lowerRoman"/>
+      <w:lvlText w:val="%9."/>
+      <w:lvlJc w:val="left"/>
+      <w:pPr>
+        <w:ind w:left="3240" w:hanging="360"/>
+      </w:pPr>
+    </w:lvl>
+  </w:abstractNum>
+  <w:abstractNum w:abstractNumId="4" w15:restartNumberingAfterBreak="0">
+    <w:nsid w:val="57133828"/>
+    <w:multiLevelType w:val="multilevel"/>
+    <w:tmpl w:val="7FCC5BEE"/>
+    <w:lvl w:ilvl="0">
+      <w:start w:val="1"/>
+      <w:numFmt w:val="decimal"/>
+      <w:lvlText w:val="%1."/>
+      <w:lvlJc w:val="left"/>
+      <w:pPr>
+        <w:ind w:left="360" w:hanging="360"/>
+      </w:pPr>
+      <w:rPr>
+        <w:rFonts w:hint="default"/>
+      </w:rPr>
+    </w:lvl>
+    <w:lvl w:ilvl="1">
+      <w:start w:val="1"/>
+      <w:numFmt w:val="decimal"/>
+      <w:lvlText w:val="%1.%2"/>
+      <w:lvlJc w:val="left"/>
+      <w:pPr>
+        <w:ind w:left="720" w:hanging="360"/>
+      </w:pPr>
+      <w:rPr>
+        <w:rFonts w:hint="default"/>
+      </w:rPr>
+    </w:lvl>
+    <w:lvl w:ilvl="2">
+      <w:start w:val="1"/>
+      <w:numFmt w:val="lowerRoman"/>
+      <w:lvlText w:val="%3)"/>
+      <w:lvlJc w:val="left"/>
+      <w:pPr>
+        <w:ind w:left="1080" w:hanging="360"/>
+      </w:pPr>
+      <w:rPr>
+        <w:rFonts w:hint="default"/>
+      </w:rPr>
+    </w:lvl>
+    <w:lvl w:ilvl="3">
+      <w:start w:val="1"/>
+      <w:numFmt w:val="decimal"/>
+      <w:lvlText w:val="(%4)"/>
+      <w:lvlJc w:val="left"/>
+      <w:pPr>
+        <w:ind w:left="1440" w:hanging="360"/>
+      </w:pPr>
+      <w:rPr>
+        <w:rFonts w:hint="default"/>
+      </w:rPr>
+    </w:lvl>
+    <w:lvl w:ilvl="4">
+      <w:start w:val="1"/>
+      <w:numFmt w:val="lowerLetter"/>
+      <w:lvlText w:val="(%5)"/>
+      <w:lvlJc w:val="left"/>
+      <w:pPr>
+        <w:ind w:left="1800" w:hanging="360"/>
+      </w:pPr>
+      <w:rPr>
+        <w:rFonts w:hint="default"/>
+      </w:rPr>
+    </w:lvl>
+    <w:lvl w:ilvl="5">
+      <w:start w:val="1"/>
+      <w:numFmt w:val="lowerRoman"/>
+      <w:lvlText w:val="(%6)"/>
+      <w:lvlJc w:val="left"/>
+      <w:pPr>
+        <w:ind w:left="2160" w:hanging="360"/>
+      </w:pPr>
+      <w:rPr>
+        <w:rFonts w:hint="default"/>
+      </w:rPr>
+    </w:lvl>
+    <w:lvl w:ilvl="6">
+      <w:start w:val="1"/>
+      <w:numFmt w:val="decimal"/>
+      <w:lvlText w:val="%7."/>
+      <w:lvlJc w:val="left"/>
+      <w:pPr>
+        <w:ind w:left="2520" w:hanging="360"/>
+      </w:pPr>
+      <w:rPr>
+        <w:rFonts w:hint="default"/>
+      </w:rPr>
+    </w:lvl>
+    <w:lvl w:ilvl="7">
+      <w:start w:val="1"/>
+      <w:numFmt w:val="lowerLetter"/>
+      <w:lvlText w:val="%8."/>
+      <w:lvlJc w:val="left"/>
+      <w:pPr>
+        <w:ind w:left="2880" w:hanging="360"/>
+      </w:pPr>
+      <w:rPr>
+        <w:rFonts w:hint="default"/>
+      </w:rPr>
+    </w:lvl>
+    <w:lvl w:ilvl="8">
+      <w:start w:val="1"/>
+      <w:numFmt w:val="lowerRoman"/>
+      <w:lvlText w:val="%9."/>
+      <w:lvlJc w:val="left"/>
+      <w:pPr>
+        <w:ind w:left="3240" w:hanging="360"/>
+      </w:pPr>
+      <w:rPr>
+        <w:rFonts w:hint="default"/>
+      </w:rPr>
+    </w:lvl>
+  </w:abstractNum>
+  <w:abstractNum w:abstractNumId="5" w15:restartNumberingAfterBreak="0">
     <w:nsid w:val="5BFF16C5"/>
     <w:multiLevelType w:val="hybridMultilevel"/>
-    <w:tmpl w:val="6A9C60A6"/>
+    <w:tmpl w:val="322E8C46"/>
     <w:lvl w:ilvl="0" w:tplc="5E0A1512">
       <w:start w:val="1"/>
       <w:numFmt w:val="decimal"/>
-      <w:pStyle w:val="Heading2"/>
       <w:lvlText w:val="%1."/>
       <w:lvlJc w:val="left"/>
       <w:pPr>
@@ -1145,10 +1944,22 @@
     </w:lvl>
   </w:abstractNum>
   <w:num w:numId="1" w16cid:durableId="200865">
+    <w:abstractNumId w:val="1"/>
+  </w:num>
+  <w:num w:numId="2" w16cid:durableId="1586038579">
+    <w:abstractNumId w:val="5"/>
+  </w:num>
+  <w:num w:numId="3" w16cid:durableId="1916936765">
     <w:abstractNumId w:val="0"/>
   </w:num>
-  <w:num w:numId="2" w16cid:durableId="1586038579">
-    <w:abstractNumId w:val="1"/>
+  <w:num w:numId="4" w16cid:durableId="511578178">
+    <w:abstractNumId w:val="4"/>
+  </w:num>
+  <w:num w:numId="5" w16cid:durableId="614794996">
+    <w:abstractNumId w:val="3"/>
+  </w:num>
+  <w:num w:numId="6" w16cid:durableId="65959534">
+    <w:abstractNumId w:val="2"/>
   </w:num>
 </w:numbering>
 </file>
@@ -1571,12 +2382,12 @@
     <w:link w:val="Heading1Char"/>
     <w:uiPriority w:val="9"/>
     <w:qFormat/>
-    <w:rsid w:val="00197F34"/>
+    <w:rsid w:val="00B81193"/>
     <w:pPr>
       <w:keepNext/>
       <w:keepLines/>
       <w:numPr>
-        <w:numId w:val="1"/>
+        <w:numId w:val="6"/>
       </w:numPr>
       <w:ind w:left="0" w:firstLine="0"/>
       <w:jc w:val="left"/>
@@ -1593,15 +2404,14 @@
     <w:basedOn w:val="Heading1"/>
     <w:link w:val="Heading2Char"/>
     <w:uiPriority w:val="9"/>
-    <w:semiHidden/>
     <w:unhideWhenUsed/>
     <w:qFormat/>
-    <w:rsid w:val="00C24AB0"/>
+    <w:rsid w:val="00B81193"/>
     <w:pPr>
       <w:numPr>
-        <w:numId w:val="2"/>
+        <w:ilvl w:val="1"/>
       </w:numPr>
-      <w:jc w:val="center"/>
+      <w:ind w:left="0" w:firstLine="0"/>
       <w:outlineLvl w:val="1"/>
     </w:pPr>
     <w:rPr>
@@ -1766,6 +2576,7 @@
   <w:style w:type="character" w:default="1" w:styleId="DefaultParagraphFont">
     <w:name w:val="Default Paragraph Font"/>
     <w:uiPriority w:val="1"/>
+    <w:semiHidden/>
     <w:unhideWhenUsed/>
   </w:style>
   <w:style w:type="table" w:default="1" w:styleId="TableNormal">
@@ -1794,7 +2605,7 @@
     <w:basedOn w:val="DefaultParagraphFont"/>
     <w:link w:val="Heading1"/>
     <w:uiPriority w:val="9"/>
-    <w:rsid w:val="00197F34"/>
+    <w:rsid w:val="00B81193"/>
     <w:rPr>
       <w:rFonts w:ascii="Georgia" w:eastAsiaTheme="majorEastAsia" w:hAnsi="Georgia" w:cstheme="majorBidi"/>
       <w:b/>
@@ -1808,8 +2619,7 @@
     <w:basedOn w:val="DefaultParagraphFont"/>
     <w:link w:val="Heading2"/>
     <w:uiPriority w:val="9"/>
-    <w:semiHidden/>
-    <w:rsid w:val="00C24AB0"/>
+    <w:rsid w:val="00B81193"/>
     <w:rPr>
       <w:rFonts w:ascii="Georgia" w:eastAsiaTheme="majorEastAsia" w:hAnsi="Georgia" w:cstheme="majorBidi"/>
       <w:b/>
@@ -2142,6 +2952,25 @@
     <w:rsid w:val="0086282A"/>
     <w:rPr>
       <w:vertAlign w:val="superscript"/>
+    </w:rPr>
+  </w:style>
+  <w:style w:type="paragraph" w:styleId="Caption">
+    <w:name w:val="caption"/>
+    <w:basedOn w:val="Normal"/>
+    <w:next w:val="Normal"/>
+    <w:uiPriority w:val="35"/>
+    <w:unhideWhenUsed/>
+    <w:qFormat/>
+    <w:rsid w:val="00A674ED"/>
+    <w:pPr>
+      <w:spacing w:before="0" w:after="200" w:line="240" w:lineRule="auto"/>
+    </w:pPr>
+    <w:rPr>
+      <w:i/>
+      <w:iCs/>
+      <w:color w:val="0E2841" w:themeColor="text2"/>
+      <w:sz w:val="18"/>
+      <w:szCs w:val="18"/>
     </w:rPr>
   </w:style>
 </w:styles>

</xml_diff>